<commit_message>
Sort extracurriculars by start date, newest first.
The CV PDF listed activities in mixed order; the site now matches the same timeline.

Co-authored-by: Cursor <cursoragent@cursor.com>
</commit_message>
<xml_diff>
--- a/papers/Ying-Yee-Yu-resume.docx
+++ b/papers/Ying-Yee-Yu-resume.docx
@@ -1189,51 +1189,51 @@
           <w:tab w:val="clear" w:pos="500"/>
           <w:tab w:val="right" w:pos="10512" w:leader="none"/>
         </w:tabs>
-        <w:spacing w:before="70" w:after="0"/>
-        <w:rPr>
-          <w:rFonts w:ascii="Times New Roman" w:hAnsi="Times New Roman" w:eastAsia="Times New Roman" w:cs="Times New Roman"/>
-          <w:b/>
-          <w:bCs/>
-          <w:sz w:val="20"/>
-          <w:szCs w:val="20"/>
-        </w:rPr>
-      </w:pPr>
-      <w:r>
-        <w:rPr>
-          <w:rFonts w:eastAsia="Times New Roman" w:cs="Times New Roman"/>
-          <w:b/>
-          <w:bCs/>
-          <w:sz w:val="20"/>
-          <w:szCs w:val="20"/>
-        </w:rPr>
-        <w:t>Asian American Athlete Alliance</w:t>
+        <w:spacing w:before="0" w:after="0"/>
+        <w:rPr>
+          <w:rFonts w:ascii="Times New Roman" w:hAnsi="Times New Roman" w:eastAsia="Times New Roman" w:cs="Times New Roman"/>
+          <w:b/>
+          <w:bCs/>
+          <w:sz w:val="20"/>
+          <w:szCs w:val="20"/>
+        </w:rPr>
+      </w:pPr>
+      <w:r>
+        <w:rPr>
+          <w:rFonts w:eastAsia="Times New Roman" w:cs="Times New Roman"/>
+          <w:b/>
+          <w:bCs/>
+          <w:sz w:val="20"/>
+          <w:szCs w:val="20"/>
+        </w:rPr>
+        <w:t>Varsity Basketball, Basis Independent Brooklyn</w:t>
         <w:tab/>
-        <w:t>2024 – Present</w:t>
-      </w:r>
-    </w:p>
-    <w:p>
-      <w:pPr>
-        <w:pStyle w:val="Normal"/>
-        <w:keepNext w:val="true"/>
-        <w:spacing w:before="0" w:after="0"/>
-        <w:rPr>
-          <w:rFonts w:ascii="Times New Roman" w:hAnsi="Times New Roman" w:eastAsia="Times New Roman" w:cs="Times New Roman"/>
-          <w:i/>
-          <w:i/>
-          <w:iCs/>
-          <w:sz w:val="20"/>
-          <w:szCs w:val="20"/>
-        </w:rPr>
-      </w:pPr>
-      <w:r>
-        <w:rPr>
-          <w:rFonts w:eastAsia="Times New Roman" w:cs="Times New Roman"/>
-          <w:i/>
-          <w:iCs/>
-          <w:sz w:val="20"/>
-          <w:szCs w:val="20"/>
-        </w:rPr>
-        <w:t>Advocate &amp; Outreach Lead</w:t>
+        <w:t>Nov 2025 – Present</w:t>
+      </w:r>
+    </w:p>
+    <w:p>
+      <w:pPr>
+        <w:pStyle w:val="Normal"/>
+        <w:keepNext w:val="true"/>
+        <w:spacing w:before="0" w:after="0"/>
+        <w:rPr>
+          <w:rFonts w:ascii="Times New Roman" w:hAnsi="Times New Roman" w:eastAsia="Times New Roman" w:cs="Times New Roman"/>
+          <w:i/>
+          <w:i/>
+          <w:iCs/>
+          <w:sz w:val="20"/>
+          <w:szCs w:val="20"/>
+        </w:rPr>
+      </w:pPr>
+      <w:r>
+        <w:rPr>
+          <w:rFonts w:eastAsia="Times New Roman" w:cs="Times New Roman"/>
+          <w:i/>
+          <w:iCs/>
+          <w:sz w:val="20"/>
+          <w:szCs w:val="20"/>
+        </w:rPr>
+        <w:t>Member (Rotating Roles)</w:t>
       </w:r>
     </w:p>
     <w:p>
@@ -1252,7 +1252,7 @@
           <w:sz w:val="20"/>
           <w:szCs w:val="20"/>
         </w:rPr>
-        <w:t>Examined how identity and culture shape athletes' experiences; cold-emailed NY sports clubs, bringing 8 teams into the alliance; planning a spring webinar</w:t>
+        <w:t>Practice 3x/week; co-organized game-film review; rotated across guard, forward, and center roles to develop adaptability</w:t>
       </w:r>
     </w:p>
     <w:p>
@@ -1280,34 +1280,34 @@
           <w:sz w:val="20"/>
           <w:szCs w:val="20"/>
         </w:rPr>
-        <w:t>Varsity Soccer, Basis Independent Brooklyn</w:t>
+        <w:t>Math Honor Society, Basis Independent Brooklyn</w:t>
         <w:tab/>
-        <w:t>Sep 2024 – Present</w:t>
-      </w:r>
-    </w:p>
-    <w:p>
-      <w:pPr>
-        <w:pStyle w:val="Normal"/>
-        <w:keepNext w:val="true"/>
-        <w:spacing w:before="0" w:after="0"/>
-        <w:rPr>
-          <w:rFonts w:ascii="Times New Roman" w:hAnsi="Times New Roman" w:eastAsia="Times New Roman" w:cs="Times New Roman"/>
-          <w:i/>
-          <w:i/>
-          <w:iCs/>
-          <w:sz w:val="20"/>
-          <w:szCs w:val="20"/>
-        </w:rPr>
-      </w:pPr>
-      <w:r>
-        <w:rPr>
-          <w:rFonts w:eastAsia="Times New Roman" w:cs="Times New Roman"/>
-          <w:i/>
-          <w:iCs/>
-          <w:sz w:val="20"/>
-          <w:szCs w:val="20"/>
-        </w:rPr>
-        <w:t>Defender</w:t>
+        <w:t>Sep 2025 – Present</w:t>
+      </w:r>
+    </w:p>
+    <w:p>
+      <w:pPr>
+        <w:pStyle w:val="Normal"/>
+        <w:keepNext w:val="true"/>
+        <w:spacing w:before="0" w:after="0"/>
+        <w:rPr>
+          <w:rFonts w:ascii="Times New Roman" w:hAnsi="Times New Roman" w:eastAsia="Times New Roman" w:cs="Times New Roman"/>
+          <w:i/>
+          <w:i/>
+          <w:iCs/>
+          <w:sz w:val="20"/>
+          <w:szCs w:val="20"/>
+        </w:rPr>
+      </w:pPr>
+      <w:r>
+        <w:rPr>
+          <w:rFonts w:eastAsia="Times New Roman" w:cs="Times New Roman"/>
+          <w:i/>
+          <w:iCs/>
+          <w:sz w:val="20"/>
+          <w:szCs w:val="20"/>
+        </w:rPr>
+        <w:t>Math Tutor</w:t>
       </w:r>
     </w:p>
     <w:p>
@@ -1326,7 +1326,7 @@
           <w:sz w:val="20"/>
           <w:szCs w:val="20"/>
         </w:rPr>
-        <w:t>Train 3x/week in drills, scrimmages, and match analysis; strengthened defensive communication and advanced to regional playoffs; beta-tested FairPlay</w:t>
+        <w:t>Co-led competition prep groups for 10+ peers; tutored 3 peers in AP Calculus through step-by-step breakdowns</w:t>
       </w:r>
     </w:p>
     <w:p>
@@ -1337,51 +1337,51 @@
           <w:tab w:val="clear" w:pos="500"/>
           <w:tab w:val="right" w:pos="10512" w:leader="none"/>
         </w:tabs>
-        <w:spacing w:before="0" w:after="0"/>
-        <w:rPr>
-          <w:rFonts w:ascii="Times New Roman" w:hAnsi="Times New Roman" w:eastAsia="Times New Roman" w:cs="Times New Roman"/>
-          <w:b/>
-          <w:bCs/>
-          <w:sz w:val="20"/>
-          <w:szCs w:val="20"/>
-        </w:rPr>
-      </w:pPr>
-      <w:r>
-        <w:rPr>
-          <w:rFonts w:eastAsia="Times New Roman" w:cs="Times New Roman"/>
-          <w:b/>
-          <w:bCs/>
-          <w:sz w:val="20"/>
-          <w:szCs w:val="20"/>
-        </w:rPr>
-        <w:t>Varsity Basketball, Basis Independent Brooklyn</w:t>
+        <w:spacing w:before="70" w:after="0"/>
+        <w:rPr>
+          <w:rFonts w:ascii="Times New Roman" w:hAnsi="Times New Roman" w:eastAsia="Times New Roman" w:cs="Times New Roman"/>
+          <w:b/>
+          <w:bCs/>
+          <w:sz w:val="20"/>
+          <w:szCs w:val="20"/>
+        </w:rPr>
+      </w:pPr>
+      <w:r>
+        <w:rPr>
+          <w:rFonts w:eastAsia="Times New Roman" w:cs="Times New Roman"/>
+          <w:b/>
+          <w:bCs/>
+          <w:sz w:val="20"/>
+          <w:szCs w:val="20"/>
+        </w:rPr>
+        <w:t>National Honor Society, Basis Independent Brooklyn</w:t>
         <w:tab/>
-        <w:t>Nov 2025 – Present</w:t>
-      </w:r>
-    </w:p>
-    <w:p>
-      <w:pPr>
-        <w:pStyle w:val="Normal"/>
-        <w:keepNext w:val="true"/>
-        <w:spacing w:before="0" w:after="0"/>
-        <w:rPr>
-          <w:rFonts w:ascii="Times New Roman" w:hAnsi="Times New Roman" w:eastAsia="Times New Roman" w:cs="Times New Roman"/>
-          <w:i/>
-          <w:i/>
-          <w:iCs/>
-          <w:sz w:val="20"/>
-          <w:szCs w:val="20"/>
-        </w:rPr>
-      </w:pPr>
-      <w:r>
-        <w:rPr>
-          <w:rFonts w:eastAsia="Times New Roman" w:cs="Times New Roman"/>
-          <w:i/>
-          <w:iCs/>
-          <w:sz w:val="20"/>
-          <w:szCs w:val="20"/>
-        </w:rPr>
-        <w:t>Member (Rotating Roles)</w:t>
+        <w:t>Sep 2025 – Present</w:t>
+      </w:r>
+    </w:p>
+    <w:p>
+      <w:pPr>
+        <w:pStyle w:val="Normal"/>
+        <w:keepNext w:val="true"/>
+        <w:spacing w:before="0" w:after="0"/>
+        <w:rPr>
+          <w:rFonts w:ascii="Times New Roman" w:hAnsi="Times New Roman" w:eastAsia="Times New Roman" w:cs="Times New Roman"/>
+          <w:i/>
+          <w:i/>
+          <w:iCs/>
+          <w:sz w:val="20"/>
+          <w:szCs w:val="20"/>
+        </w:rPr>
+      </w:pPr>
+      <w:r>
+        <w:rPr>
+          <w:rFonts w:eastAsia="Times New Roman" w:cs="Times New Roman"/>
+          <w:i/>
+          <w:iCs/>
+          <w:sz w:val="20"/>
+          <w:szCs w:val="20"/>
+        </w:rPr>
+        <w:t>Service Lead &amp; Member</w:t>
       </w:r>
     </w:p>
     <w:p>
@@ -1400,7 +1400,7 @@
           <w:sz w:val="20"/>
           <w:szCs w:val="20"/>
         </w:rPr>
-        <w:t>Practice 3x/week; co-organized game-film review; rotated across guard, forward, and center roles to develop adaptability</w:t>
+        <w:t>Led a team of 5 in neighborhood cleanups and urban farming; taught food-justice lessons to local children; 45+ service hours annually</w:t>
       </w:r>
     </w:p>
     <w:p>
@@ -1428,34 +1428,34 @@
           <w:sz w:val="20"/>
           <w:szCs w:val="20"/>
         </w:rPr>
-        <w:t>East Asian Culture Club, Basis Independent Brooklyn</w:t>
+        <w:t>Brooklyn Public Library</w:t>
         <w:tab/>
-        <w:t>Sep 2024 – Present</w:t>
-      </w:r>
-    </w:p>
-    <w:p>
-      <w:pPr>
-        <w:pStyle w:val="Normal"/>
-        <w:keepNext w:val="true"/>
-        <w:spacing w:before="0" w:after="0"/>
-        <w:rPr>
-          <w:rFonts w:ascii="Times New Roman" w:hAnsi="Times New Roman" w:eastAsia="Times New Roman" w:cs="Times New Roman"/>
-          <w:i/>
-          <w:i/>
-          <w:iCs/>
-          <w:sz w:val="20"/>
-          <w:szCs w:val="20"/>
-        </w:rPr>
-      </w:pPr>
-      <w:r>
-        <w:rPr>
-          <w:rFonts w:eastAsia="Times New Roman" w:cs="Times New Roman"/>
-          <w:i/>
-          <w:iCs/>
-          <w:sz w:val="20"/>
-          <w:szCs w:val="20"/>
-        </w:rPr>
-        <w:t>Co-Head</w:t>
+        <w:t>Sep 2025 – Present</w:t>
+      </w:r>
+    </w:p>
+    <w:p>
+      <w:pPr>
+        <w:pStyle w:val="Normal"/>
+        <w:keepNext w:val="true"/>
+        <w:spacing w:before="0" w:after="0"/>
+        <w:rPr>
+          <w:rFonts w:ascii="Times New Roman" w:hAnsi="Times New Roman" w:eastAsia="Times New Roman" w:cs="Times New Roman"/>
+          <w:i/>
+          <w:i/>
+          <w:iCs/>
+          <w:sz w:val="20"/>
+          <w:szCs w:val="20"/>
+        </w:rPr>
+      </w:pPr>
+      <w:r>
+        <w:rPr>
+          <w:rFonts w:eastAsia="Times New Roman" w:cs="Times New Roman"/>
+          <w:i/>
+          <w:iCs/>
+          <w:sz w:val="20"/>
+          <w:szCs w:val="20"/>
+        </w:rPr>
+        <w:t>Volunteer Staff Assistant</w:t>
       </w:r>
     </w:p>
     <w:p>
@@ -1470,12 +1470,11 @@
       </w:pPr>
       <w:r>
         <w:rPr>
-          <w:rFonts w:cs="Times New Roman"/>
-          <w:sz w:val="20"/>
-          <w:szCs w:val="20"/>
-          <w:lang w:val="en-US"/>
-        </w:rPr>
-        <w:t>Designed &amp; ran pan-Asian culture games; invited the Mandarin class to our Mid-Autumn Festival, pairing students with 1-on-1 language practice buddies.</w:t>
+          <w:rFonts w:eastAsia="Times New Roman" w:cs="Times New Roman"/>
+          <w:sz w:val="20"/>
+          <w:szCs w:val="20"/>
+        </w:rPr>
+        <w:t>Facilitated weekend homework sessions for 5 middle school students as a reading buddy; helped patrons navigate technology with library resources</w:t>
       </w:r>
     </w:p>
     <w:p>
@@ -1503,34 +1502,34 @@
           <w:sz w:val="20"/>
           <w:szCs w:val="20"/>
         </w:rPr>
-        <w:t>Math Honor Society, Basis Independent Brooklyn</w:t>
+        <w:t>Schoolhouse.world</w:t>
         <w:tab/>
-        <w:t>Sep 2025 – Present</w:t>
-      </w:r>
-    </w:p>
-    <w:p>
-      <w:pPr>
-        <w:pStyle w:val="Normal"/>
-        <w:keepNext w:val="true"/>
-        <w:spacing w:before="0" w:after="0"/>
-        <w:rPr>
-          <w:rFonts w:ascii="Times New Roman" w:hAnsi="Times New Roman" w:eastAsia="Times New Roman" w:cs="Times New Roman"/>
-          <w:i/>
-          <w:i/>
-          <w:iCs/>
-          <w:sz w:val="20"/>
-          <w:szCs w:val="20"/>
-        </w:rPr>
-      </w:pPr>
-      <w:r>
-        <w:rPr>
-          <w:rFonts w:eastAsia="Times New Roman" w:cs="Times New Roman"/>
-          <w:i/>
-          <w:iCs/>
-          <w:sz w:val="20"/>
-          <w:szCs w:val="20"/>
-        </w:rPr>
-        <w:t>Math Tutor</w:t>
+        <w:t>Jan 2025 – Present</w:t>
+      </w:r>
+    </w:p>
+    <w:p>
+      <w:pPr>
+        <w:pStyle w:val="Normal"/>
+        <w:keepNext w:val="true"/>
+        <w:spacing w:before="0" w:after="0"/>
+        <w:rPr>
+          <w:rFonts w:ascii="Times New Roman" w:hAnsi="Times New Roman" w:eastAsia="Times New Roman" w:cs="Times New Roman"/>
+          <w:i/>
+          <w:i/>
+          <w:iCs/>
+          <w:sz w:val="20"/>
+          <w:szCs w:val="20"/>
+        </w:rPr>
+      </w:pPr>
+      <w:r>
+        <w:rPr>
+          <w:rFonts w:eastAsia="Times New Roman" w:cs="Times New Roman"/>
+          <w:i/>
+          <w:iCs/>
+          <w:sz w:val="20"/>
+          <w:szCs w:val="20"/>
+        </w:rPr>
+        <w:t>Certified Calculus &amp; SAT Math Tutor</w:t>
       </w:r>
     </w:p>
     <w:p>
@@ -1549,7 +1548,7 @@
           <w:sz w:val="20"/>
           <w:szCs w:val="20"/>
         </w:rPr>
-        <w:t>Co-led competition prep groups for 10+ peers; tutored 3 peers in AP Calculus through step-by-step breakdowns</w:t>
+        <w:t>Tutor 4 students biweekly with targeted practice and custom study guides tailored to individual learning gaps</w:t>
       </w:r>
     </w:p>
     <w:p>
@@ -1577,34 +1576,34 @@
           <w:sz w:val="20"/>
           <w:szCs w:val="20"/>
         </w:rPr>
-        <w:t>Found &amp; Worn (personal vintage archive)</w:t>
+        <w:t>Varsity Soccer, Basis Independent Brooklyn</w:t>
         <w:tab/>
-        <w:t>2023 – Present</w:t>
-      </w:r>
-    </w:p>
-    <w:p>
-      <w:pPr>
-        <w:pStyle w:val="Normal"/>
-        <w:keepNext w:val="true"/>
-        <w:spacing w:before="0" w:after="0"/>
-        <w:rPr>
-          <w:rFonts w:ascii="Times New Roman" w:hAnsi="Times New Roman" w:eastAsia="Times New Roman" w:cs="Times New Roman"/>
-          <w:i/>
-          <w:i/>
-          <w:iCs/>
-          <w:sz w:val="20"/>
-          <w:szCs w:val="20"/>
-        </w:rPr>
-      </w:pPr>
-      <w:r>
-        <w:rPr>
-          <w:rFonts w:eastAsia="Times New Roman" w:cs="Times New Roman"/>
-          <w:i/>
-          <w:iCs/>
-          <w:sz w:val="20"/>
-          <w:szCs w:val="20"/>
-        </w:rPr>
-        <w:t>Vintage Buyer &amp; Collector</w:t>
+        <w:t>Sep 2024 – Present</w:t>
+      </w:r>
+    </w:p>
+    <w:p>
+      <w:pPr>
+        <w:pStyle w:val="Normal"/>
+        <w:keepNext w:val="true"/>
+        <w:spacing w:before="0" w:after="0"/>
+        <w:rPr>
+          <w:rFonts w:ascii="Times New Roman" w:hAnsi="Times New Roman" w:eastAsia="Times New Roman" w:cs="Times New Roman"/>
+          <w:i/>
+          <w:i/>
+          <w:iCs/>
+          <w:sz w:val="20"/>
+          <w:szCs w:val="20"/>
+        </w:rPr>
+      </w:pPr>
+      <w:r>
+        <w:rPr>
+          <w:rFonts w:eastAsia="Times New Roman" w:cs="Times New Roman"/>
+          <w:i/>
+          <w:iCs/>
+          <w:sz w:val="20"/>
+          <w:szCs w:val="20"/>
+        </w:rPr>
+        <w:t>Defender</w:t>
       </w:r>
     </w:p>
     <w:p>
@@ -1623,7 +1622,7 @@
           <w:sz w:val="20"/>
           <w:szCs w:val="20"/>
         </w:rPr>
-        <w:t>Trace tags, cuts, repairs, and histories of vintage pieces; explore how music, culture, scarcity, and stories shape my understanding of era, brand, and design</w:t>
+        <w:t>Train 3x/week in drills, scrimmages, and match analysis; strengthened defensive communication and advanced to regional playoffs; beta-tested FairPlay</w:t>
       </w:r>
     </w:p>
     <w:p>
@@ -1651,34 +1650,34 @@
           <w:sz w:val="20"/>
           <w:szCs w:val="20"/>
         </w:rPr>
-        <w:t>National Honor Society, Basis Independent Brooklyn</w:t>
+        <w:t>East Asian Culture Club, Basis Independent Brooklyn</w:t>
         <w:tab/>
-        <w:t>Sep 2025 – Present</w:t>
-      </w:r>
-    </w:p>
-    <w:p>
-      <w:pPr>
-        <w:pStyle w:val="Normal"/>
-        <w:keepNext w:val="true"/>
-        <w:spacing w:before="0" w:after="0"/>
-        <w:rPr>
-          <w:rFonts w:ascii="Times New Roman" w:hAnsi="Times New Roman" w:eastAsia="Times New Roman" w:cs="Times New Roman"/>
-          <w:i/>
-          <w:i/>
-          <w:iCs/>
-          <w:sz w:val="20"/>
-          <w:szCs w:val="20"/>
-        </w:rPr>
-      </w:pPr>
-      <w:r>
-        <w:rPr>
-          <w:rFonts w:eastAsia="Times New Roman" w:cs="Times New Roman"/>
-          <w:i/>
-          <w:iCs/>
-          <w:sz w:val="20"/>
-          <w:szCs w:val="20"/>
-        </w:rPr>
-        <w:t>Service Lead &amp; Member</w:t>
+        <w:t>Sep 2024 – Present</w:t>
+      </w:r>
+    </w:p>
+    <w:p>
+      <w:pPr>
+        <w:pStyle w:val="Normal"/>
+        <w:keepNext w:val="true"/>
+        <w:spacing w:before="0" w:after="0"/>
+        <w:rPr>
+          <w:rFonts w:ascii="Times New Roman" w:hAnsi="Times New Roman" w:eastAsia="Times New Roman" w:cs="Times New Roman"/>
+          <w:i/>
+          <w:i/>
+          <w:iCs/>
+          <w:sz w:val="20"/>
+          <w:szCs w:val="20"/>
+        </w:rPr>
+      </w:pPr>
+      <w:r>
+        <w:rPr>
+          <w:rFonts w:eastAsia="Times New Roman" w:cs="Times New Roman"/>
+          <w:i/>
+          <w:iCs/>
+          <w:sz w:val="20"/>
+          <w:szCs w:val="20"/>
+        </w:rPr>
+        <w:t>Co-Head</w:t>
       </w:r>
     </w:p>
     <w:p>
@@ -1693,11 +1692,12 @@
       </w:pPr>
       <w:r>
         <w:rPr>
-          <w:rFonts w:eastAsia="Times New Roman" w:cs="Times New Roman"/>
-          <w:sz w:val="20"/>
-          <w:szCs w:val="20"/>
-        </w:rPr>
-        <w:t>Led a team of 5 in neighborhood cleanups and urban farming; taught food-justice lessons to local children; 45+ service hours annually</w:t>
+          <w:rFonts w:cs="Times New Roman"/>
+          <w:sz w:val="20"/>
+          <w:szCs w:val="20"/>
+          <w:lang w:val="en-US"/>
+        </w:rPr>
+        <w:t>Designed &amp; ran pan-Asian culture games; invited the Mandarin class to our Mid-Autumn Festival, pairing students with 1-on-1 language practice buddies.</w:t>
       </w:r>
     </w:p>
     <w:p>
@@ -1725,34 +1725,34 @@
           <w:sz w:val="20"/>
           <w:szCs w:val="20"/>
         </w:rPr>
-        <w:t>Brooklyn Public Library</w:t>
+        <w:t>Asian American Athlete Alliance</w:t>
         <w:tab/>
-        <w:t>Sep 2025 – Present</w:t>
-      </w:r>
-    </w:p>
-    <w:p>
-      <w:pPr>
-        <w:pStyle w:val="Normal"/>
-        <w:keepNext w:val="true"/>
-        <w:spacing w:before="0" w:after="0"/>
-        <w:rPr>
-          <w:rFonts w:ascii="Times New Roman" w:hAnsi="Times New Roman" w:eastAsia="Times New Roman" w:cs="Times New Roman"/>
-          <w:i/>
-          <w:i/>
-          <w:iCs/>
-          <w:sz w:val="20"/>
-          <w:szCs w:val="20"/>
-        </w:rPr>
-      </w:pPr>
-      <w:r>
-        <w:rPr>
-          <w:rFonts w:eastAsia="Times New Roman" w:cs="Times New Roman"/>
-          <w:i/>
-          <w:iCs/>
-          <w:sz w:val="20"/>
-          <w:szCs w:val="20"/>
-        </w:rPr>
-        <w:t>Volunteer Staff Assistant</w:t>
+        <w:t>2024 – Present</w:t>
+      </w:r>
+    </w:p>
+    <w:p>
+      <w:pPr>
+        <w:pStyle w:val="Normal"/>
+        <w:keepNext w:val="true"/>
+        <w:spacing w:before="0" w:after="0"/>
+        <w:rPr>
+          <w:rFonts w:ascii="Times New Roman" w:hAnsi="Times New Roman" w:eastAsia="Times New Roman" w:cs="Times New Roman"/>
+          <w:i/>
+          <w:i/>
+          <w:iCs/>
+          <w:sz w:val="20"/>
+          <w:szCs w:val="20"/>
+        </w:rPr>
+      </w:pPr>
+      <w:r>
+        <w:rPr>
+          <w:rFonts w:eastAsia="Times New Roman" w:cs="Times New Roman"/>
+          <w:i/>
+          <w:iCs/>
+          <w:sz w:val="20"/>
+          <w:szCs w:val="20"/>
+        </w:rPr>
+        <w:t>Advocate &amp; Outreach Lead</w:t>
       </w:r>
     </w:p>
     <w:p>
@@ -1771,7 +1771,7 @@
           <w:sz w:val="20"/>
           <w:szCs w:val="20"/>
         </w:rPr>
-        <w:t>Facilitated weekend homework sessions for 5 middle school students as a reading buddy; helped patrons navigate technology with library resources</w:t>
+        <w:t>Examined how identity and culture shape athletes' experiences; cold-emailed NY sports clubs, bringing 8 teams into the alliance; planning a spring webinar</w:t>
       </w:r>
     </w:p>
     <w:p>
@@ -1799,34 +1799,34 @@
           <w:sz w:val="20"/>
           <w:szCs w:val="20"/>
         </w:rPr>
-        <w:t>Schoolhouse.world</w:t>
+        <w:t>Found &amp; Worn (personal vintage archive)</w:t>
         <w:tab/>
-        <w:t>Jan 2025 – Present</w:t>
-      </w:r>
-    </w:p>
-    <w:p>
-      <w:pPr>
-        <w:pStyle w:val="Normal"/>
-        <w:keepNext w:val="true"/>
-        <w:spacing w:before="0" w:after="0"/>
-        <w:rPr>
-          <w:rFonts w:ascii="Times New Roman" w:hAnsi="Times New Roman" w:eastAsia="Times New Roman" w:cs="Times New Roman"/>
-          <w:i/>
-          <w:i/>
-          <w:iCs/>
-          <w:sz w:val="20"/>
-          <w:szCs w:val="20"/>
-        </w:rPr>
-      </w:pPr>
-      <w:r>
-        <w:rPr>
-          <w:rFonts w:eastAsia="Times New Roman" w:cs="Times New Roman"/>
-          <w:i/>
-          <w:iCs/>
-          <w:sz w:val="20"/>
-          <w:szCs w:val="20"/>
-        </w:rPr>
-        <w:t>Certified Calculus &amp; SAT Math Tutor</w:t>
+        <w:t>2023 – Present</w:t>
+      </w:r>
+    </w:p>
+    <w:p>
+      <w:pPr>
+        <w:pStyle w:val="Normal"/>
+        <w:keepNext w:val="true"/>
+        <w:spacing w:before="0" w:after="0"/>
+        <w:rPr>
+          <w:rFonts w:ascii="Times New Roman" w:hAnsi="Times New Roman" w:eastAsia="Times New Roman" w:cs="Times New Roman"/>
+          <w:i/>
+          <w:i/>
+          <w:iCs/>
+          <w:sz w:val="20"/>
+          <w:szCs w:val="20"/>
+        </w:rPr>
+      </w:pPr>
+      <w:r>
+        <w:rPr>
+          <w:rFonts w:eastAsia="Times New Roman" w:cs="Times New Roman"/>
+          <w:i/>
+          <w:iCs/>
+          <w:sz w:val="20"/>
+          <w:szCs w:val="20"/>
+        </w:rPr>
+        <w:t>Vintage Buyer &amp; Collector</w:t>
       </w:r>
     </w:p>
     <w:p>
@@ -1845,7 +1845,7 @@
           <w:sz w:val="20"/>
           <w:szCs w:val="20"/>
         </w:rPr>
-        <w:t>Tutor 4 students biweekly with targeted practice and custom study guides tailored to individual learning gaps</w:t>
+        <w:t>Trace tags, cuts, repairs, and histories of vintage pieces; explore how music, culture, scarcity, and stories shape my understanding of era, brand, and design</w:t>
       </w:r>
     </w:p>
     <w:p>

</xml_diff>